<commit_message>
fix: update student names and enhance report structure in assignment_02
</commit_message>
<xml_diff>
--- a/assignment_02/report.docx
+++ b/assignment_02/report.docx
@@ -79,7 +79,7 @@
         <w:t xml:space="preserve"> </w:t>
       </w:r>
       <w:r>
-        <w:t xml:space="preserve">(To be completed by Buddy)</w:t>
+        <w:t xml:space="preserve">Kuber Pathak (2026AIM1027)</w:t>
       </w:r>
     </w:p>
     <w:p>
@@ -329,7 +329,7 @@
         <w:rPr>
           <w:rStyle w:val="VerbatimChar"/>
         </w:rPr>
-        <w:t xml:space="preserve">    |   |-- betweenness_centrality.h (Blank for Buddy)</w:t>
+        <w:t xml:space="preserve">    |   |-- betweenness_centrality.h</w:t>
       </w:r>
       <w:r>
         <w:br/>
@@ -383,7 +383,7 @@
         <w:rPr>
           <w:rStyle w:val="VerbatimChar"/>
         </w:rPr>
-        <w:t xml:space="preserve">    |   |-- betweenness_centrality.cpp (Blank for Buddy)</w:t>
+        <w:t xml:space="preserve">    |   |-- betweenness_centrality.cpp </w:t>
       </w:r>
       <w:r>
         <w:br/>
@@ -2270,6 +2270,39 @@
               <w:pStyle w:val="Compact"/>
             </w:pPr>
             <w:r>
+              <w:t xml:space="preserve">bc_10.txt</w:t>
+            </w:r>
+          </w:p>
+        </w:tc>
+        <w:tc>
+          <w:tcPr/>
+          <w:p>
+            <w:pPr>
+              <w:pStyle w:val="Compact"/>
+            </w:pPr>
+            <w:r>
+              <w:t xml:space="preserve">10</w:t>
+            </w:r>
+          </w:p>
+        </w:tc>
+        <w:tc>
+          <w:tcPr/>
+          <w:p>
+            <w:pPr>
+              <w:pStyle w:val="Compact"/>
+            </w:pPr>
+            <w:r>
+              <w:t xml:space="preserve">19</w:t>
+            </w:r>
+          </w:p>
+        </w:tc>
+        <w:tc>
+          <w:tcPr/>
+          <w:p>
+            <w:pPr>
+              <w:pStyle w:val="Compact"/>
+            </w:pPr>
+            <w:r>
               <w:t xml:space="preserve">-</w:t>
             </w:r>
           </w:p>
@@ -2292,6 +2325,74 @@
               <w:pStyle w:val="Compact"/>
             </w:pPr>
             <w:r>
+              <w:t xml:space="preserve">78.2 us</w:t>
+            </w:r>
+          </w:p>
+        </w:tc>
+        <w:tc>
+          <w:tcPr/>
+          <w:p>
+            <w:pPr>
+              <w:pStyle w:val="Compact"/>
+            </w:pPr>
+            <w:r>
+              <w:t xml:space="preserve">Pass</w:t>
+            </w:r>
+          </w:p>
+        </w:tc>
+      </w:tr>
+      <w:tr>
+        <w:tc>
+          <w:tcPr/>
+          <w:p>
+            <w:pPr>
+              <w:pStyle w:val="Compact"/>
+            </w:pPr>
+            <w:r>
+              <w:t xml:space="preserve">Betweenness Centrality</w:t>
+            </w:r>
+          </w:p>
+        </w:tc>
+        <w:tc>
+          <w:tcPr/>
+          <w:p>
+            <w:pPr>
+              <w:pStyle w:val="Compact"/>
+            </w:pPr>
+            <w:r>
+              <w:t xml:space="preserve">bc_100.txt</w:t>
+            </w:r>
+          </w:p>
+        </w:tc>
+        <w:tc>
+          <w:tcPr/>
+          <w:p>
+            <w:pPr>
+              <w:pStyle w:val="Compact"/>
+            </w:pPr>
+            <w:r>
+              <w:t xml:space="preserve">100</w:t>
+            </w:r>
+          </w:p>
+        </w:tc>
+        <w:tc>
+          <w:tcPr/>
+          <w:p>
+            <w:pPr>
+              <w:pStyle w:val="Compact"/>
+            </w:pPr>
+            <w:r>
+              <w:t xml:space="preserve">199</w:t>
+            </w:r>
+          </w:p>
+        </w:tc>
+        <w:tc>
+          <w:tcPr/>
+          <w:p>
+            <w:pPr>
+              <w:pStyle w:val="Compact"/>
+            </w:pPr>
+            <w:r>
               <w:t xml:space="preserve">-</w:t>
             </w:r>
           </w:p>
@@ -2314,7 +2415,64 @@
               <w:pStyle w:val="Compact"/>
             </w:pPr>
             <w:r>
-              <w:t xml:space="preserve">Stub for Buddy</w:t>
+              <w:t xml:space="preserve">5361.3 us</w:t>
+            </w:r>
+          </w:p>
+        </w:tc>
+        <w:tc>
+          <w:tcPr/>
+          <w:p>
+            <w:pPr>
+              <w:pStyle w:val="Compact"/>
+            </w:pPr>
+            <w:r>
+              <w:t xml:space="preserve">Pass</w:t>
+            </w:r>
+          </w:p>
+        </w:tc>
+      </w:tr>
+      <w:tr>
+        <w:tc>
+          <w:tcPr/>
+          <w:p>
+            <w:pPr>
+              <w:pStyle w:val="Compact"/>
+            </w:pPr>
+            <w:r>
+              <w:t xml:space="preserve">Betweenness Centrality</w:t>
+            </w:r>
+          </w:p>
+        </w:tc>
+        <w:tc>
+          <w:tcPr/>
+          <w:p>
+            <w:pPr>
+              <w:pStyle w:val="Compact"/>
+            </w:pPr>
+            <w:r>
+              <w:t xml:space="preserve">bc_1000.txt</w:t>
+            </w:r>
+          </w:p>
+        </w:tc>
+        <w:tc>
+          <w:tcPr/>
+          <w:p>
+            <w:pPr>
+              <w:pStyle w:val="Compact"/>
+            </w:pPr>
+            <w:r>
+              <w:t xml:space="preserve">1000</w:t>
+            </w:r>
+          </w:p>
+        </w:tc>
+        <w:tc>
+          <w:tcPr/>
+          <w:p>
+            <w:pPr>
+              <w:pStyle w:val="Compact"/>
+            </w:pPr>
+            <w:r>
+              <w:t xml:space="preserve">1999</w:t>
             </w:r>
           </w:p>
         </w:tc>
@@ -2337,6 +2495,208 @@
             </w:pPr>
             <w:r>
               <w:t xml:space="preserve">-</w:t>
+            </w:r>
+          </w:p>
+        </w:tc>
+        <w:tc>
+          <w:tcPr/>
+          <w:p>
+            <w:pPr>
+              <w:pStyle w:val="Compact"/>
+            </w:pPr>
+            <w:r>
+              <w:t xml:space="preserve">530504 us</w:t>
+            </w:r>
+          </w:p>
+        </w:tc>
+        <w:tc>
+          <w:tcPr/>
+          <w:p>
+            <w:pPr>
+              <w:pStyle w:val="Compact"/>
+            </w:pPr>
+            <w:r>
+              <w:t xml:space="preserve">Pass</w:t>
+            </w:r>
+          </w:p>
+        </w:tc>
+      </w:tr>
+      <w:tr>
+        <w:tc>
+          <w:tcPr/>
+          <w:p>
+            <w:pPr>
+              <w:pStyle w:val="Compact"/>
+            </w:pPr>
+            <w:r>
+              <w:t xml:space="preserve">Betweenness Centrality</w:t>
+            </w:r>
+          </w:p>
+        </w:tc>
+        <w:tc>
+          <w:tcPr/>
+          <w:p>
+            <w:pPr>
+              <w:pStyle w:val="Compact"/>
+            </w:pPr>
+            <w:r>
+              <w:t xml:space="preserve">bc_5000.txt</w:t>
+            </w:r>
+          </w:p>
+        </w:tc>
+        <w:tc>
+          <w:tcPr/>
+          <w:p>
+            <w:pPr>
+              <w:pStyle w:val="Compact"/>
+            </w:pPr>
+            <w:r>
+              <w:t xml:space="preserve">5000</w:t>
+            </w:r>
+          </w:p>
+        </w:tc>
+        <w:tc>
+          <w:tcPr/>
+          <w:p>
+            <w:pPr>
+              <w:pStyle w:val="Compact"/>
+            </w:pPr>
+            <w:r>
+              <w:t xml:space="preserve">9999</w:t>
+            </w:r>
+          </w:p>
+        </w:tc>
+        <w:tc>
+          <w:tcPr/>
+          <w:p>
+            <w:pPr>
+              <w:pStyle w:val="Compact"/>
+            </w:pPr>
+            <w:r>
+              <w:t xml:space="preserve">-</w:t>
+            </w:r>
+          </w:p>
+        </w:tc>
+        <w:tc>
+          <w:tcPr/>
+          <w:p>
+            <w:pPr>
+              <w:pStyle w:val="Compact"/>
+            </w:pPr>
+            <w:r>
+              <w:t xml:space="preserve">-</w:t>
+            </w:r>
+          </w:p>
+        </w:tc>
+        <w:tc>
+          <w:tcPr/>
+          <w:p>
+            <w:pPr>
+              <w:pStyle w:val="Compact"/>
+            </w:pPr>
+            <w:r>
+              <w:t xml:space="preserve">1.39184e+07 us</w:t>
+            </w:r>
+          </w:p>
+        </w:tc>
+        <w:tc>
+          <w:tcPr/>
+          <w:p>
+            <w:pPr>
+              <w:pStyle w:val="Compact"/>
+            </w:pPr>
+            <w:r>
+              <w:t xml:space="preserve">Pass</w:t>
+            </w:r>
+          </w:p>
+        </w:tc>
+      </w:tr>
+      <w:tr>
+        <w:tc>
+          <w:tcPr/>
+          <w:p>
+            <w:pPr>
+              <w:pStyle w:val="Compact"/>
+            </w:pPr>
+            <w:r>
+              <w:t xml:space="preserve">Betweenness Centrality</w:t>
+            </w:r>
+          </w:p>
+        </w:tc>
+        <w:tc>
+          <w:tcPr/>
+          <w:p>
+            <w:pPr>
+              <w:pStyle w:val="Compact"/>
+            </w:pPr>
+            <w:r>
+              <w:t xml:space="preserve">bc_10000.txt</w:t>
+            </w:r>
+          </w:p>
+        </w:tc>
+        <w:tc>
+          <w:tcPr/>
+          <w:p>
+            <w:pPr>
+              <w:pStyle w:val="Compact"/>
+            </w:pPr>
+            <w:r>
+              <w:t xml:space="preserve">10000</w:t>
+            </w:r>
+          </w:p>
+        </w:tc>
+        <w:tc>
+          <w:tcPr/>
+          <w:p>
+            <w:pPr>
+              <w:pStyle w:val="Compact"/>
+            </w:pPr>
+            <w:r>
+              <w:t xml:space="preserve">19999</w:t>
+            </w:r>
+          </w:p>
+        </w:tc>
+        <w:tc>
+          <w:tcPr/>
+          <w:p>
+            <w:pPr>
+              <w:pStyle w:val="Compact"/>
+            </w:pPr>
+            <w:r>
+              <w:t xml:space="preserve">-</w:t>
+            </w:r>
+          </w:p>
+        </w:tc>
+        <w:tc>
+          <w:tcPr/>
+          <w:p>
+            <w:pPr>
+              <w:pStyle w:val="Compact"/>
+            </w:pPr>
+            <w:r>
+              <w:t xml:space="preserve">-</w:t>
+            </w:r>
+          </w:p>
+        </w:tc>
+        <w:tc>
+          <w:tcPr/>
+          <w:p>
+            <w:pPr>
+              <w:pStyle w:val="Compact"/>
+            </w:pPr>
+            <w:r>
+              <w:t xml:space="preserve">6.20534e+07 us</w:t>
+            </w:r>
+          </w:p>
+        </w:tc>
+        <w:tc>
+          <w:tcPr/>
+          <w:p>
+            <w:pPr>
+              <w:pStyle w:val="Compact"/>
+            </w:pPr>
+            <w:r>
+              <w:t xml:space="preserve">Pass</w:t>
             </w:r>
           </w:p>
         </w:tc>

</xml_diff>